<commit_message>
Rename the copyright filing title to Unicode PUA mapping.
Use 基于动态字体与Unicode私有使用区码位映射的文本防采集器 in the spec, source header, and checklist.

Co-authored-by: Soulver <Soulver@users.noreply.github.com>
</commit_message>
<xml_diff>
--- a/软著申请材料/软件说明书.docx
+++ b/软著申请材料/软件说明书.docx
@@ -27,7 +27,7 @@
           <w:b/>
           <w:sz w:val="24"/>
         </w:rPr>
-        <w:t>基于动态字体与Unicode区码位映射的文本防采集器</w:t>
+        <w:t>基于动态字体与Unicode私有使用区码位映射的文本防采集器</w:t>
         <w:br/>
         <w:t>版本号：V1.0</w:t>
       </w:r>
@@ -56,7 +56,7 @@
           <w:b w:val="0"/>
           <w:sz w:val="24"/>
         </w:rPr>
-        <w:t>本文档旨在为“基于动态字体与Unicode区码位映射的文本防采集器”（以下简称“本软件”）申请中华人民共和国国家版权局计算机软件著作权登记，提供系统性的技术说明与功能证明。作为鉴别材料之文档部分，本文档将从问题域界定、体系结构、核心算法、安全边界与工程实现等层面，对本软件的独创性表达予以完整呈现。</w:t>
+        <w:t>本文档旨在为“基于动态字体与Unicode私有使用区码位映射的文本防采集器”（以下简称“本软件”）申请中华人民共和国国家版权局计算机软件著作权登记，提供系统性的技术说明与功能证明。作为鉴别材料之文档部分，本文档将从问题域界定、体系结构、核心算法、安全边界与工程实现等层面，对本软件的独创性表达予以完整呈现。</w:t>
       </w:r>
     </w:p>
     <w:p>
@@ -70,7 +70,7 @@
           <w:b w:val="0"/>
           <w:sz w:val="24"/>
         </w:rPr>
-        <w:t>本软件系作者针对公开万维网超文本环境中，长文本正文易被自动化程序经由标记语言源码、文档对象模型文本接口及应用程序接口响应体直接提取这一技术事实，独立构思并实现的原创性软件作品。其名称中“Unicode区码位映射”所指，为将可读字符之Unicode标量值映射至Unicode私有使用区（Private Use Area，PUA）及必要时之补充私有使用区，并与动态生成的OpenType子集字体之字符到字形映射表（cmap）形成共生交付关系。文档重点阐述如下方面：</w:t>
+        <w:t>本软件系作者针对公开万维网超文本环境中，长文本正文易被自动化程序经由标记语言源码、文档对象模型文本接口及应用程序接口响应体直接提取这一技术事实，独立构思并实现的原创性软件作品。其名称中“Unicode私有使用区码位映射”所指，为将可读字符之Unicode标量值映射至Unicode私有使用区（Private Use Area，PUA）及必要时之补充私有使用区，并与动态生成的OpenType子集字体之字符到字形映射表（cmap）形成共生交付关系。文档重点阐述如下方面：</w:t>
       </w:r>
     </w:p>
     <w:p>
@@ -166,7 +166,7 @@
           <w:b w:val="0"/>
           <w:sz w:val="24"/>
         </w:rPr>
-        <w:t>软件全称：基于动态字体与Unicode区码位映射的文本防采集器</w:t>
+        <w:t>软件全称：基于动态字体与Unicode私有使用区码位映射的文本防采集器</w:t>
       </w:r>
     </w:p>
     <w:p>
@@ -1927,7 +1927,7 @@
           <w:b w:val="0"/>
           <w:sz w:val="24"/>
         </w:rPr>
-        <w:t>综上所述，“基于动态字体与Unicode区码位映射的文本防采集器”是作者独立设计、自主开发的原创性软件成果。它针对公开网页长文易被自动化采集之问题，将Unicode私有区码位映射、OpenType动态子集化、超文本结构保持、短时访问凭证、源隔离与修订失效组合成可部署的文本防采集系统，并提供标准嵌入方式接入既有站点。</w:t>
+        <w:t>综上所述，“基于动态字体与Unicode私有使用区码位映射的文本防采集器”是作者独立设计、自主开发的原创性软件成果。它针对公开网页长文易被自动化采集之问题，将Unicode私有区码位映射、OpenType动态子集化、超文本结构保持、短时访问凭证、源隔离与修订失效组合成可部署的文本防采集系统，并提供标准嵌入方式接入既有站点。</w:t>
       </w:r>
     </w:p>
     <w:p>
@@ -2089,7 +2089,7 @@
         <w:b w:val="0"/>
         <w:sz w:val="18"/>
       </w:rPr>
-      <w:t>基于动态字体与Unicode区码位映射的文本防采集器 V1.0</w:t>
+      <w:t>基于动态字体与Unicode私有使用区码位映射的文本防采集器 V1.0</w:t>
     </w:r>
   </w:p>
 </w:hdr>

</xml_diff>